<commit_message>
fin Association Rule Mining
</commit_message>
<xml_diff>
--- a/7275/wk9/How do the different distance measures.docx
+++ b/7275/wk9/How do the different distance measures.docx
@@ -27,7 +27,134 @@
       </w:r>
     </w:p>
     <w:p/>
-    <w:p/>
+    <w:p>
+      <w:r>
+        <w:t>This is an important choice in the clustering techniques, because it will determine how “similarity” mean in different context, and how outliners are handled.</w:t>
+      </w:r>
+    </w:p>
+    <w:p>
+      <w:r>
+        <w:t xml:space="preserve">Take Euclidean distance for example, it calculates the </w:t>
+      </w:r>
+      <w:proofErr w:type="gramStart"/>
+      <w:r>
+        <w:t>straight line</w:t>
+      </w:r>
+      <w:proofErr w:type="gramEnd"/>
+      <w:r>
+        <w:t xml:space="preserve"> distance, as the same radius from the point, naturally a spherical shape is formed. This works out if the data follows this pattern; however, once the shape changes, this will impact K-means’ sphere </w:t>
+      </w:r>
+      <w:proofErr w:type="spellStart"/>
+      <w:r>
+        <w:t>approache</w:t>
+      </w:r>
+      <w:proofErr w:type="spellEnd"/>
+      <w:r>
+        <w:t xml:space="preserve">. </w:t>
+      </w:r>
+    </w:p>
+    <w:p>
+      <w:r>
+        <w:t xml:space="preserve">Euclidean distance impact DBSCAN a little bit </w:t>
+      </w:r>
+      <w:proofErr w:type="gramStart"/>
+      <w:r>
+        <w:t xml:space="preserve">different,  </w:t>
+      </w:r>
+      <w:r>
+        <w:t>it</w:t>
+      </w:r>
+      <w:proofErr w:type="gramEnd"/>
+      <w:r>
+        <w:t xml:space="preserve"> is </w:t>
+      </w:r>
+      <w:r>
+        <w:t>sensitive</w:t>
+      </w:r>
+      <w:r>
+        <w:t xml:space="preserve"> to scales of the </w:t>
+      </w:r>
+      <w:proofErr w:type="gramStart"/>
+      <w:r>
+        <w:t>data,,</w:t>
+      </w:r>
+      <w:proofErr w:type="gramEnd"/>
+      <w:r>
+        <w:t xml:space="preserve"> thus normalization would be an important step.</w:t>
+      </w:r>
+    </w:p>
+    <w:p>
+      <w:r>
+        <w:t xml:space="preserve">The </w:t>
+      </w:r>
+      <w:proofErr w:type="spellStart"/>
+      <w:r>
+        <w:t>manhataan</w:t>
+      </w:r>
+      <w:proofErr w:type="spellEnd"/>
+      <w:r>
+        <w:t xml:space="preserve"> distance is also known as city block distance; it can change K means to K </w:t>
+      </w:r>
+      <w:proofErr w:type="gramStart"/>
+      <w:r>
+        <w:t>medians, and</w:t>
+      </w:r>
+      <w:proofErr w:type="gramEnd"/>
+      <w:r>
+        <w:t xml:space="preserve"> is robust to outliers. It also has impact on DBSCAN, and is preferred for higher </w:t>
+      </w:r>
+      <w:proofErr w:type="spellStart"/>
+      <w:r>
+        <w:t>deminsional</w:t>
+      </w:r>
+      <w:proofErr w:type="spellEnd"/>
+      <w:r>
+        <w:t xml:space="preserve"> data, and the result is </w:t>
+      </w:r>
+      <w:proofErr w:type="spellStart"/>
+      <w:r>
+        <w:t>daggged</w:t>
+      </w:r>
+      <w:proofErr w:type="spellEnd"/>
+      <w:r>
+        <w:t xml:space="preserve"> shape of the distribution.</w:t>
+      </w:r>
+    </w:p>
+    <w:p>
+      <w:r>
+        <w:t xml:space="preserve">The cosine </w:t>
+      </w:r>
+      <w:proofErr w:type="spellStart"/>
+      <w:r>
+        <w:t>similiarity</w:t>
+      </w:r>
+      <w:proofErr w:type="spellEnd"/>
+      <w:r>
+        <w:t xml:space="preserve"> measure the angle, also known as phase in some discipline.</w:t>
+      </w:r>
+      <w:r>
+        <w:t xml:space="preserve"> It is very good at text mining. For k means and DBSCAN, a distance is required so we will need to convert cosine </w:t>
+      </w:r>
+      <w:proofErr w:type="spellStart"/>
+      <w:r>
+        <w:t>simioalirty</w:t>
+      </w:r>
+      <w:proofErr w:type="spellEnd"/>
+      <w:r>
+        <w:t xml:space="preserve"> (angle) to</w:t>
+      </w:r>
+      <w:r>
+        <w:t xml:space="preserve"> </w:t>
+      </w:r>
+      <w:r>
+        <w:t>distance (1 – similarity).</w:t>
+      </w:r>
+    </w:p>
+    <w:p>
+      <w:r>
+        <w:t xml:space="preserve"> </w:t>
+      </w:r>
+    </w:p>
     <w:p/>
     <w:sectPr>
       <w:pgSz w:w="12240" w:h="15840"/>

</xml_diff>